<commit_message>
Restore Cytoscape knowledge graph (clean solid clickable nodes); make sources report + site digest RTL/Persian-first per 1400 guideline
</commit_message>
<xml_diff>
--- a/web/گزارش_تحلیل_منابع.docx
+++ b/web/گزارش_تحلیل_منابع.docx
@@ -198,7 +198,7 @@
           <w:bCs/>
           <w:color w:val="b08d3f"/>
         </w:rPr>
-        <w:t xml:space="preserve">1. </w:t>
+        <w:t xml:space="preserve">۱. </w:t>
       </w:r>
       <w:r>
         <w:rPr>
@@ -207,7 +207,7 @@
           <w:szCs w:val="24"/>
           <w:rtl w:val="1"/>
         </w:rPr>
-        <w:t>Tigre, M. A. (2022) — The Evolution of International Environmental Law Amidst Political Gridlock: Environmental Rights as a Common Ground</w:t>
+        <w:t>تیگره (۲۰۲۲) — تحولِ حقوق بین‌الملل محیط زیست در میانهٔ بن‌بستِ سیاسی: حقوقِ محیط‌زیستی همچون زمینهٔ مشترک</w:t>
       </w:r>
     </w:p>
     <w:p>
@@ -226,7 +226,7 @@
           <w:bCs/>
           <w:color w:val="b08d3f"/>
         </w:rPr>
-        <w:t xml:space="preserve">2. </w:t>
+        <w:t xml:space="preserve">۲. </w:t>
       </w:r>
       <w:r>
         <w:rPr>
@@ -235,7 +235,7 @@
           <w:szCs w:val="24"/>
           <w:rtl w:val="1"/>
         </w:rPr>
-        <w:t>Tiller, D. (2018) — Are the Aims of the Proposed Global Pact for the Environment Desirable and Will the Pact Add Any Value to International Environmental Law?</w:t>
+        <w:t>تیلر (۲۰۱۸) — آیا اهدافِ پیمانِ جهانیِ پیشنهادیِ محیط زیست مطلوب‌اند و آیا پیمان ارزش‌افزوده‌ای به حقوق بین‌الملل محیط زیست می‌افزاید؟</w:t>
       </w:r>
     </w:p>
     <w:p>
@@ -254,7 +254,7 @@
           <w:bCs/>
           <w:color w:val="b08d3f"/>
         </w:rPr>
-        <w:t xml:space="preserve">3. </w:t>
+        <w:t xml:space="preserve">۳. </w:t>
       </w:r>
       <w:r>
         <w:rPr>
@@ -263,7 +263,7 @@
           <w:szCs w:val="24"/>
           <w:rtl w:val="1"/>
         </w:rPr>
-        <w:t>Chabason, L. &amp; Hege, E. (2019) — Failure of the Global Pact for the Environment: a missed opportunity or a bullet dodged?</w:t>
+        <w:t>چاباسون و اِژه (۲۰۱۹) — شکستِ پیمانِ جهانیِ محیط زیست: فرصتی ازدست‌رفته یا تیری ازکنارگذشته؟</w:t>
       </w:r>
     </w:p>
     <w:p>
@@ -282,7 +282,7 @@
           <w:bCs/>
           <w:color w:val="b08d3f"/>
         </w:rPr>
-        <w:t xml:space="preserve">4. </w:t>
+        <w:t xml:space="preserve">۴. </w:t>
       </w:r>
       <w:r>
         <w:rPr>
@@ -291,7 +291,7 @@
           <w:szCs w:val="24"/>
           <w:rtl w:val="1"/>
         </w:rPr>
-        <w:t>International Law Commission (Study Group; Koskenniemi, M., رئیس) (2006) — Conclusions of the work of the Study Group on the Fragmentation of International Law: Difficulties arising from the Diversification and Expansion of International Law</w:t>
+        <w:t>کمیسیون حقوق بین‌الملل (کوسکِنیِمی) (۲۰۰۶) — نتیجه‌گیریِ کارِ گروهِ مطالعاتیِ چندپارگیِ حقوق بین‌الملل: دشواری‌های ناشی از تنوع و گسترشِ حقوق بین‌الملل</w:t>
       </w:r>
     </w:p>
     <w:p>
@@ -310,7 +310,7 @@
           <w:bCs/>
           <w:color w:val="b08d3f"/>
         </w:rPr>
-        <w:t xml:space="preserve">5. </w:t>
+        <w:t xml:space="preserve">۵. </w:t>
       </w:r>
       <w:r>
         <w:rPr>
@@ -319,7 +319,7 @@
           <w:szCs w:val="24"/>
           <w:rtl w:val="1"/>
         </w:rPr>
-        <w:t>⚠ Damoah, B., Keengwe, J. S. &amp; Ofori, E. (2026) — Stalemate in the Anthropocene: Ineffective Treaties and the Struggle for Planetary Governance</w:t>
+        <w:t>⚠ داموآ و همکاران (۲۰۲۶) — بن‌بست در انتروپوسن: معاهداتِ ناکارآمد و کشمکش بر سرِ حکمرانیِ سیّاره‌ای</w:t>
       </w:r>
     </w:p>
     <w:p>
@@ -338,7 +338,7 @@
           <w:bCs/>
           <w:color w:val="b08d3f"/>
         </w:rPr>
-        <w:t xml:space="preserve">6. </w:t>
+        <w:t xml:space="preserve">۶. </w:t>
       </w:r>
       <w:r>
         <w:rPr>
@@ -347,7 +347,7 @@
           <w:szCs w:val="24"/>
           <w:rtl w:val="1"/>
         </w:rPr>
-        <w:t>Draft Global Pact for the Environment (پیش‌نویسِ گروهِ حقوق‌دانانِ بین‌المللی) (2017) — Draft Global Pact for the Environment (Projet de Pacte mondial pour l'environnement) — 26 Articles</w:t>
+        <w:t>پیش‌نویسِ پیمان (گروهِ حقوق‌دانان / IUCN) (۲۰۱۷) — پیش‌نویسِ پیمانِ جهانیِ محیط زیست — ۲۶ ماده</w:t>
       </w:r>
     </w:p>
     <w:p>
@@ -372,7 +372,7 @@
           <w:bCs/>
           <w:color w:val="14203a"/>
         </w:rPr>
-        <w:t>منبعِ 1: The Evolution of International Environmental Law Amidst Political Gridlock: Environmental Rights as a Common Ground</w:t>
+        <w:t>منبعِ ۱: تیگره (۲۰۲۲)</w:t>
       </w:r>
     </w:p>
     <w:p>
@@ -411,6 +411,62 @@
           <w:bCs/>
           <w:color w:val="14203a"/>
         </w:rPr>
+        <w:t xml:space="preserve">عنوان (فارسی): </w:t>
+      </w:r>
+      <w:r>
+        <w:rPr>
+          <w:rFonts w:ascii="Times New Roman" w:hAnsi="Times New Roman" w:cs="B Nazanin"/>
+          <w:sz w:val="22"/>
+          <w:szCs w:val="24"/>
+          <w:rtl w:val="1"/>
+        </w:rPr>
+        <w:t>تحولِ حقوق بین‌الملل محیط زیست در میانهٔ بن‌بستِ سیاسی: حقوقِ محیط‌زیستی همچون زمینهٔ مشترک</w:t>
+      </w:r>
+    </w:p>
+    <w:p>
+      <w:pPr>
+        <w:bidi w:val="1"/>
+        <w:spacing w:line="312" w:lineRule="auto" w:before="0" w:after="60"/>
+        <w:jc w:val="right"/>
+      </w:pPr>
+      <w:r>
+        <w:rPr>
+          <w:rFonts w:ascii="Times New Roman" w:hAnsi="Times New Roman" w:cs="B Nazanin"/>
+          <w:sz w:val="22"/>
+          <w:szCs w:val="24"/>
+          <w:rtl w:val="1"/>
+          <w:b/>
+          <w:bCs/>
+          <w:color w:val="14203a"/>
+        </w:rPr>
+        <w:t xml:space="preserve">عنوانِ اصلی (لاتین): </w:t>
+      </w:r>
+      <w:r>
+        <w:rPr>
+          <w:rFonts w:ascii="Times New Roman" w:hAnsi="Times New Roman" w:cs="B Nazanin"/>
+          <w:sz w:val="22"/>
+          <w:szCs w:val="24"/>
+          <w:rtl w:val="1"/>
+        </w:rPr>
+        <w:t>The Evolution of International Environmental Law Amidst Political Gridlock: Environmental Rights as a Common Ground</w:t>
+      </w:r>
+    </w:p>
+    <w:p>
+      <w:pPr>
+        <w:bidi w:val="1"/>
+        <w:spacing w:line="312" w:lineRule="auto" w:before="0" w:after="60"/>
+        <w:jc w:val="right"/>
+      </w:pPr>
+      <w:r>
+        <w:rPr>
+          <w:rFonts w:ascii="Times New Roman" w:hAnsi="Times New Roman" w:cs="B Nazanin"/>
+          <w:sz w:val="22"/>
+          <w:szCs w:val="24"/>
+          <w:rtl w:val="1"/>
+          <w:b/>
+          <w:bCs/>
+          <w:color w:val="14203a"/>
+        </w:rPr>
         <w:t xml:space="preserve">پدیدآور: </w:t>
       </w:r>
       <w:r>
@@ -448,7 +504,7 @@
           <w:szCs w:val="24"/>
           <w:rtl w:val="1"/>
         </w:rPr>
-        <w:t>2022</w:t>
+        <w:t>۲۰۲۲</w:t>
       </w:r>
     </w:p>
     <w:p>
@@ -532,7 +588,7 @@
           <w:szCs w:val="24"/>
           <w:rtl w:val="1"/>
         </w:rPr>
-        <w:t>97 از ۱۰۰</w:t>
+        <w:t>۹۷ از ۱۰۰</w:t>
       </w:r>
     </w:p>
     <w:p>
@@ -951,7 +1007,7 @@
           <w:bCs/>
           <w:color w:val="14203a"/>
         </w:rPr>
-        <w:t>منبعِ 2: Are the Aims of the Proposed Global Pact for the Environment Desirable and Will the Pact Add Any Value to International Environmental Law?</w:t>
+        <w:t>منبعِ ۲: تیلر (۲۰۱۸)</w:t>
       </w:r>
     </w:p>
     <w:p>
@@ -990,6 +1046,62 @@
           <w:bCs/>
           <w:color w:val="14203a"/>
         </w:rPr>
+        <w:t xml:space="preserve">عنوان (فارسی): </w:t>
+      </w:r>
+      <w:r>
+        <w:rPr>
+          <w:rFonts w:ascii="Times New Roman" w:hAnsi="Times New Roman" w:cs="B Nazanin"/>
+          <w:sz w:val="22"/>
+          <w:szCs w:val="24"/>
+          <w:rtl w:val="1"/>
+        </w:rPr>
+        <w:t>آیا اهدافِ پیمانِ جهانیِ پیشنهادیِ محیط زیست مطلوب‌اند و آیا پیمان ارزش‌افزوده‌ای به حقوق بین‌الملل محیط زیست می‌افزاید؟</w:t>
+      </w:r>
+    </w:p>
+    <w:p>
+      <w:pPr>
+        <w:bidi w:val="1"/>
+        <w:spacing w:line="312" w:lineRule="auto" w:before="0" w:after="60"/>
+        <w:jc w:val="right"/>
+      </w:pPr>
+      <w:r>
+        <w:rPr>
+          <w:rFonts w:ascii="Times New Roman" w:hAnsi="Times New Roman" w:cs="B Nazanin"/>
+          <w:sz w:val="22"/>
+          <w:szCs w:val="24"/>
+          <w:rtl w:val="1"/>
+          <w:b/>
+          <w:bCs/>
+          <w:color w:val="14203a"/>
+        </w:rPr>
+        <w:t xml:space="preserve">عنوانِ اصلی (لاتین): </w:t>
+      </w:r>
+      <w:r>
+        <w:rPr>
+          <w:rFonts w:ascii="Times New Roman" w:hAnsi="Times New Roman" w:cs="B Nazanin"/>
+          <w:sz w:val="22"/>
+          <w:szCs w:val="24"/>
+          <w:rtl w:val="1"/>
+        </w:rPr>
+        <w:t>Are the Aims of the Proposed Global Pact for the Environment Desirable and Will the Pact Add Any Value to International Environmental Law?</w:t>
+      </w:r>
+    </w:p>
+    <w:p>
+      <w:pPr>
+        <w:bidi w:val="1"/>
+        <w:spacing w:line="312" w:lineRule="auto" w:before="0" w:after="60"/>
+        <w:jc w:val="right"/>
+      </w:pPr>
+      <w:r>
+        <w:rPr>
+          <w:rFonts w:ascii="Times New Roman" w:hAnsi="Times New Roman" w:cs="B Nazanin"/>
+          <w:sz w:val="22"/>
+          <w:szCs w:val="24"/>
+          <w:rtl w:val="1"/>
+          <w:b/>
+          <w:bCs/>
+          <w:color w:val="14203a"/>
+        </w:rPr>
         <w:t xml:space="preserve">پدیدآور: </w:t>
       </w:r>
       <w:r>
@@ -1027,7 +1139,7 @@
           <w:szCs w:val="24"/>
           <w:rtl w:val="1"/>
         </w:rPr>
-        <w:t>2018</w:t>
+        <w:t>۲۰۱۸</w:t>
       </w:r>
     </w:p>
     <w:p>
@@ -1111,7 +1223,7 @@
           <w:szCs w:val="24"/>
           <w:rtl w:val="1"/>
         </w:rPr>
-        <w:t>90 از ۱۰۰</w:t>
+        <w:t>۹۰ از ۱۰۰</w:t>
       </w:r>
     </w:p>
     <w:p>
@@ -1530,7 +1642,7 @@
           <w:bCs/>
           <w:color w:val="14203a"/>
         </w:rPr>
-        <w:t>منبعِ 3: Failure of the Global Pact for the Environment: a missed opportunity or a bullet dodged?</w:t>
+        <w:t>منبعِ ۳: چاباسون و اِژه (۲۰۱۹)</w:t>
       </w:r>
     </w:p>
     <w:p>
@@ -1569,6 +1681,62 @@
           <w:bCs/>
           <w:color w:val="14203a"/>
         </w:rPr>
+        <w:t xml:space="preserve">عنوان (فارسی): </w:t>
+      </w:r>
+      <w:r>
+        <w:rPr>
+          <w:rFonts w:ascii="Times New Roman" w:hAnsi="Times New Roman" w:cs="B Nazanin"/>
+          <w:sz w:val="22"/>
+          <w:szCs w:val="24"/>
+          <w:rtl w:val="1"/>
+        </w:rPr>
+        <w:t>شکستِ پیمانِ جهانیِ محیط زیست: فرصتی ازدست‌رفته یا تیری ازکنارگذشته؟</w:t>
+      </w:r>
+    </w:p>
+    <w:p>
+      <w:pPr>
+        <w:bidi w:val="1"/>
+        <w:spacing w:line="312" w:lineRule="auto" w:before="0" w:after="60"/>
+        <w:jc w:val="right"/>
+      </w:pPr>
+      <w:r>
+        <w:rPr>
+          <w:rFonts w:ascii="Times New Roman" w:hAnsi="Times New Roman" w:cs="B Nazanin"/>
+          <w:sz w:val="22"/>
+          <w:szCs w:val="24"/>
+          <w:rtl w:val="1"/>
+          <w:b/>
+          <w:bCs/>
+          <w:color w:val="14203a"/>
+        </w:rPr>
+        <w:t xml:space="preserve">عنوانِ اصلی (لاتین): </w:t>
+      </w:r>
+      <w:r>
+        <w:rPr>
+          <w:rFonts w:ascii="Times New Roman" w:hAnsi="Times New Roman" w:cs="B Nazanin"/>
+          <w:sz w:val="22"/>
+          <w:szCs w:val="24"/>
+          <w:rtl w:val="1"/>
+        </w:rPr>
+        <w:t>Failure of the Global Pact for the Environment: a missed opportunity or a bullet dodged?</w:t>
+      </w:r>
+    </w:p>
+    <w:p>
+      <w:pPr>
+        <w:bidi w:val="1"/>
+        <w:spacing w:line="312" w:lineRule="auto" w:before="0" w:after="60"/>
+        <w:jc w:val="right"/>
+      </w:pPr>
+      <w:r>
+        <w:rPr>
+          <w:rFonts w:ascii="Times New Roman" w:hAnsi="Times New Roman" w:cs="B Nazanin"/>
+          <w:sz w:val="22"/>
+          <w:szCs w:val="24"/>
+          <w:rtl w:val="1"/>
+          <w:b/>
+          <w:bCs/>
+          <w:color w:val="14203a"/>
+        </w:rPr>
         <w:t xml:space="preserve">پدیدآور: </w:t>
       </w:r>
       <w:r>
@@ -1606,7 +1774,7 @@
           <w:szCs w:val="24"/>
           <w:rtl w:val="1"/>
         </w:rPr>
-        <w:t>2019</w:t>
+        <w:t>۲۰۱۹</w:t>
       </w:r>
     </w:p>
     <w:p>
@@ -1690,7 +1858,7 @@
           <w:szCs w:val="24"/>
           <w:rtl w:val="1"/>
         </w:rPr>
-        <w:t>88 از ۱۰۰</w:t>
+        <w:t>۸۸ از ۱۰۰</w:t>
       </w:r>
     </w:p>
     <w:p>
@@ -2109,7 +2277,7 @@
           <w:bCs/>
           <w:color w:val="14203a"/>
         </w:rPr>
-        <w:t>منبعِ 4: Conclusions of the work of the Study Group on the Fragmentation of International Law: Difficulties arising from the Diversification and Expansion of International Law</w:t>
+        <w:t>منبعِ ۴: کمیسیون حقوق بین‌الملل (کوسکِنیِمی) (۲۰۰۶)</w:t>
       </w:r>
     </w:p>
     <w:p>
@@ -2148,6 +2316,62 @@
           <w:bCs/>
           <w:color w:val="14203a"/>
         </w:rPr>
+        <w:t xml:space="preserve">عنوان (فارسی): </w:t>
+      </w:r>
+      <w:r>
+        <w:rPr>
+          <w:rFonts w:ascii="Times New Roman" w:hAnsi="Times New Roman" w:cs="B Nazanin"/>
+          <w:sz w:val="22"/>
+          <w:szCs w:val="24"/>
+          <w:rtl w:val="1"/>
+        </w:rPr>
+        <w:t>نتیجه‌گیریِ کارِ گروهِ مطالعاتیِ چندپارگیِ حقوق بین‌الملل: دشواری‌های ناشی از تنوع و گسترشِ حقوق بین‌الملل</w:t>
+      </w:r>
+    </w:p>
+    <w:p>
+      <w:pPr>
+        <w:bidi w:val="1"/>
+        <w:spacing w:line="312" w:lineRule="auto" w:before="0" w:after="60"/>
+        <w:jc w:val="right"/>
+      </w:pPr>
+      <w:r>
+        <w:rPr>
+          <w:rFonts w:ascii="Times New Roman" w:hAnsi="Times New Roman" w:cs="B Nazanin"/>
+          <w:sz w:val="22"/>
+          <w:szCs w:val="24"/>
+          <w:rtl w:val="1"/>
+          <w:b/>
+          <w:bCs/>
+          <w:color w:val="14203a"/>
+        </w:rPr>
+        <w:t xml:space="preserve">عنوانِ اصلی (لاتین): </w:t>
+      </w:r>
+      <w:r>
+        <w:rPr>
+          <w:rFonts w:ascii="Times New Roman" w:hAnsi="Times New Roman" w:cs="B Nazanin"/>
+          <w:sz w:val="22"/>
+          <w:szCs w:val="24"/>
+          <w:rtl w:val="1"/>
+        </w:rPr>
+        <w:t>Conclusions of the work of the Study Group on the Fragmentation of International Law: Difficulties arising from the Diversification and Expansion of International Law</w:t>
+      </w:r>
+    </w:p>
+    <w:p>
+      <w:pPr>
+        <w:bidi w:val="1"/>
+        <w:spacing w:line="312" w:lineRule="auto" w:before="0" w:after="60"/>
+        <w:jc w:val="right"/>
+      </w:pPr>
+      <w:r>
+        <w:rPr>
+          <w:rFonts w:ascii="Times New Roman" w:hAnsi="Times New Roman" w:cs="B Nazanin"/>
+          <w:sz w:val="22"/>
+          <w:szCs w:val="24"/>
+          <w:rtl w:val="1"/>
+          <w:b/>
+          <w:bCs/>
+          <w:color w:val="14203a"/>
+        </w:rPr>
         <w:t xml:space="preserve">پدیدآور: </w:t>
       </w:r>
       <w:r>
@@ -2185,7 +2409,7 @@
           <w:szCs w:val="24"/>
           <w:rtl w:val="1"/>
         </w:rPr>
-        <w:t>2006</w:t>
+        <w:t>۲۰۰۶</w:t>
       </w:r>
     </w:p>
     <w:p>
@@ -2269,7 +2493,7 @@
           <w:szCs w:val="24"/>
           <w:rtl w:val="1"/>
         </w:rPr>
-        <w:t>95 از ۱۰۰</w:t>
+        <w:t>۹۵ از ۱۰۰</w:t>
       </w:r>
     </w:p>
     <w:p>
@@ -2688,7 +2912,7 @@
           <w:bCs/>
           <w:color w:val="14203a"/>
         </w:rPr>
-        <w:t>منبعِ 5: Stalemate in the Anthropocene: Ineffective Treaties and the Struggle for Planetary Governance</w:t>
+        <w:t>منبعِ ۵: داموآ و همکاران (۲۰۲۶)</w:t>
       </w:r>
     </w:p>
     <w:p>
@@ -2727,6 +2951,62 @@
           <w:bCs/>
           <w:color w:val="14203a"/>
         </w:rPr>
+        <w:t xml:space="preserve">عنوان (فارسی): </w:t>
+      </w:r>
+      <w:r>
+        <w:rPr>
+          <w:rFonts w:ascii="Times New Roman" w:hAnsi="Times New Roman" w:cs="B Nazanin"/>
+          <w:sz w:val="22"/>
+          <w:szCs w:val="24"/>
+          <w:rtl w:val="1"/>
+        </w:rPr>
+        <w:t>بن‌بست در انتروپوسن: معاهداتِ ناکارآمد و کشمکش بر سرِ حکمرانیِ سیّاره‌ای</w:t>
+      </w:r>
+    </w:p>
+    <w:p>
+      <w:pPr>
+        <w:bidi w:val="1"/>
+        <w:spacing w:line="312" w:lineRule="auto" w:before="0" w:after="60"/>
+        <w:jc w:val="right"/>
+      </w:pPr>
+      <w:r>
+        <w:rPr>
+          <w:rFonts w:ascii="Times New Roman" w:hAnsi="Times New Roman" w:cs="B Nazanin"/>
+          <w:sz w:val="22"/>
+          <w:szCs w:val="24"/>
+          <w:rtl w:val="1"/>
+          <w:b/>
+          <w:bCs/>
+          <w:color w:val="14203a"/>
+        </w:rPr>
+        <w:t xml:space="preserve">عنوانِ اصلی (لاتین): </w:t>
+      </w:r>
+      <w:r>
+        <w:rPr>
+          <w:rFonts w:ascii="Times New Roman" w:hAnsi="Times New Roman" w:cs="B Nazanin"/>
+          <w:sz w:val="22"/>
+          <w:szCs w:val="24"/>
+          <w:rtl w:val="1"/>
+        </w:rPr>
+        <w:t>Stalemate in the Anthropocene: Ineffective Treaties and the Struggle for Planetary Governance</w:t>
+      </w:r>
+    </w:p>
+    <w:p>
+      <w:pPr>
+        <w:bidi w:val="1"/>
+        <w:spacing w:line="312" w:lineRule="auto" w:before="0" w:after="60"/>
+        <w:jc w:val="right"/>
+      </w:pPr>
+      <w:r>
+        <w:rPr>
+          <w:rFonts w:ascii="Times New Roman" w:hAnsi="Times New Roman" w:cs="B Nazanin"/>
+          <w:sz w:val="22"/>
+          <w:szCs w:val="24"/>
+          <w:rtl w:val="1"/>
+          <w:b/>
+          <w:bCs/>
+          <w:color w:val="14203a"/>
+        </w:rPr>
         <w:t xml:space="preserve">پدیدآور: </w:t>
       </w:r>
       <w:r>
@@ -2764,7 +3044,7 @@
           <w:szCs w:val="24"/>
           <w:rtl w:val="1"/>
         </w:rPr>
-        <w:t>2026</w:t>
+        <w:t>۲۰۲۶</w:t>
       </w:r>
     </w:p>
     <w:p>
@@ -2876,7 +3156,7 @@
           <w:szCs w:val="24"/>
           <w:rtl w:val="1"/>
         </w:rPr>
-        <w:t>84 از ۱۰۰</w:t>
+        <w:t>۸۴ از ۱۰۰</w:t>
       </w:r>
     </w:p>
     <w:p>
@@ -3323,7 +3603,7 @@
           <w:bCs/>
           <w:color w:val="14203a"/>
         </w:rPr>
-        <w:t>منبعِ 6: Draft Global Pact for the Environment (Projet de Pacte mondial pour l'environnement) — 26 Articles</w:t>
+        <w:t>منبعِ ۶: پیش‌نویسِ پیمان (گروهِ حقوق‌دانان / IUCN) (۲۰۱۷)</w:t>
       </w:r>
     </w:p>
     <w:p>
@@ -3362,6 +3642,62 @@
           <w:bCs/>
           <w:color w:val="14203a"/>
         </w:rPr>
+        <w:t xml:space="preserve">عنوان (فارسی): </w:t>
+      </w:r>
+      <w:r>
+        <w:rPr>
+          <w:rFonts w:ascii="Times New Roman" w:hAnsi="Times New Roman" w:cs="B Nazanin"/>
+          <w:sz w:val="22"/>
+          <w:szCs w:val="24"/>
+          <w:rtl w:val="1"/>
+        </w:rPr>
+        <w:t>پیش‌نویسِ پیمانِ جهانیِ محیط زیست — ۲۶ ماده</w:t>
+      </w:r>
+    </w:p>
+    <w:p>
+      <w:pPr>
+        <w:bidi w:val="1"/>
+        <w:spacing w:line="312" w:lineRule="auto" w:before="0" w:after="60"/>
+        <w:jc w:val="right"/>
+      </w:pPr>
+      <w:r>
+        <w:rPr>
+          <w:rFonts w:ascii="Times New Roman" w:hAnsi="Times New Roman" w:cs="B Nazanin"/>
+          <w:sz w:val="22"/>
+          <w:szCs w:val="24"/>
+          <w:rtl w:val="1"/>
+          <w:b/>
+          <w:bCs/>
+          <w:color w:val="14203a"/>
+        </w:rPr>
+        <w:t xml:space="preserve">عنوانِ اصلی (لاتین): </w:t>
+      </w:r>
+      <w:r>
+        <w:rPr>
+          <w:rFonts w:ascii="Times New Roman" w:hAnsi="Times New Roman" w:cs="B Nazanin"/>
+          <w:sz w:val="22"/>
+          <w:szCs w:val="24"/>
+          <w:rtl w:val="1"/>
+        </w:rPr>
+        <w:t>Draft Global Pact for the Environment (Projet de Pacte mondial pour l'environnement) — 26 Articles</w:t>
+      </w:r>
+    </w:p>
+    <w:p>
+      <w:pPr>
+        <w:bidi w:val="1"/>
+        <w:spacing w:line="312" w:lineRule="auto" w:before="0" w:after="60"/>
+        <w:jc w:val="right"/>
+      </w:pPr>
+      <w:r>
+        <w:rPr>
+          <w:rFonts w:ascii="Times New Roman" w:hAnsi="Times New Roman" w:cs="B Nazanin"/>
+          <w:sz w:val="22"/>
+          <w:szCs w:val="24"/>
+          <w:rtl w:val="1"/>
+          <w:b/>
+          <w:bCs/>
+          <w:color w:val="14203a"/>
+        </w:rPr>
         <w:t xml:space="preserve">پدیدآور: </w:t>
       </w:r>
       <w:r>
@@ -3399,7 +3735,7 @@
           <w:szCs w:val="24"/>
           <w:rtl w:val="1"/>
         </w:rPr>
-        <w:t>2017</w:t>
+        <w:t>۲۰۱۷</w:t>
       </w:r>
     </w:p>
     <w:p>
@@ -3483,7 +3819,7 @@
           <w:szCs w:val="24"/>
           <w:rtl w:val="1"/>
         </w:rPr>
-        <w:t>96 از ۱۰۰</w:t>
+        <w:t>۹۶ از ۱۰۰</w:t>
       </w:r>
     </w:p>
     <w:p>

</xml_diff>